<commit_message>
Rebuild COP SOPs — remove italic Why: label (template fix retrofit)
Reruns build_cop_sops_v2.py against the already-fixed
sop_record_common.py so COP's SOP body text drops the "Why:" label
in the same way PSQ/HIC/IMS already do. No content or source
changes — mechanical re-render only.

Co-Authored-By: Claude Sonnet 5 <noreply@anthropic.com>
Claude-Session: https://claude.ai/code/session_016VFLsECWt4VArpBiaqgrgF
</commit_message>
<xml_diff>
--- a/policies/build/sop_record_masters/COP/SOP_COP.1.a_to_e_uniform_care_telemedicine.docx
+++ b/policies/build/sop_record_masters/COP/SOP_COP.1.a_to_e_uniform_care_telemedicine.docx
@@ -208,12 +208,6 @@
     </w:p>
     <w:p>
       <w:r>
-        <w:rPr>
-          <w:i/>
-        </w:rPr>
-        <w:t xml:space="preserve">Why: </w:t>
-      </w:r>
-      <w:r>
         <w:t>so every setting that provides care -- OPD, day-care, wards, theatre, telemedicine -- works from the same identification and protocol standard.</w:t>
       </w:r>
     </w:p>
@@ -231,12 +225,6 @@
       </w:r>
     </w:p>
     <w:p>
-      <w:r>
-        <w:rPr>
-          <w:i/>
-        </w:rPr>
-        <w:t xml:space="preserve">Why: </w:t>
-      </w:r>
       <w:r>
         <w:t>care that depends on which room a patient is in, rather than on their condition, is exactly what uniform care exists to prevent.</w:t>
       </w:r>
@@ -325,12 +313,6 @@
     </w:p>
     <w:p>
       <w:r>
-        <w:rPr>
-          <w:i/>
-        </w:rPr>
-        <w:t xml:space="preserve">Why: </w:t>
-      </w:r>
-      <w:r>
         <w:t>A bed number, room number or tray position identifies a location, not a person -- and a location can be occupied by someone else between the order being written and the act of care being given.</w:t>
       </w:r>
     </w:p>
@@ -353,12 +335,6 @@
       </w:r>
     </w:p>
     <w:p>
-      <w:r>
-        <w:rPr>
-          <w:i/>
-        </w:rPr>
-        <w:t xml:space="preserve">Why: </w:t>
-      </w:r>
       <w:r>
         <w:t>A law list copied from another hospital's chapter, or one that was never updated when a service changed, tells staff they are compliant with laws that may no longer be the ones that actually govern what this hospital does.</w:t>
       </w:r>
@@ -388,12 +364,6 @@
     </w:p>
     <w:p>
       <w:r>
-        <w:rPr>
-          <w:i/>
-        </w:rPr>
-        <w:t xml:space="preserve">Why: </w:t>
-      </w:r>
-      <w:r>
         <w:t>A protocol that was adopted once and never dated, version-controlled or withdrawn when superseded leaves staff unable to tell a current instruction from an old one -- which is the same failure as having no protocol at all.</w:t>
       </w:r>
     </w:p>
@@ -416,12 +386,6 @@
       </w:r>
     </w:p>
     <w:p>
-      <w:r>
-        <w:rPr>
-          <w:i/>
-        </w:rPr>
-        <w:t xml:space="preserve">Why: </w:t>
-      </w:r>
       <w:r>
         <w:t>A protocol known on the ward and unknown in day-care, or a consultant's personal variant that differs between the out-patient clinic and the theatre, means a patient's care depends on which room they happen to be in rather than on their condition -- which is exactly what uniform care exists to stop.</w:t>
       </w:r>
@@ -455,12 +419,6 @@
       </w:r>
     </w:p>
     <w:p>
-      <w:r>
-        <w:rPr>
-          <w:i/>
-        </w:rPr>
-        <w:t xml:space="preserve">Why: </w:t>
-      </w:r>
       <w:r>
         <w:t>Without a written decision either way, informal remote advice happens anyway -- a message, an unsigned prescription sent as a photo, a telephone instruction with no record -- and the hospital discovers it only after something has already gone wrong.</w:t>
       </w:r>

</xml_diff>